<commit_message>
Add exercises and track data with Git LFS
</commit_message>
<xml_diff>
--- a/OlpAI/Lab5/thuc_hanh_5.docx
+++ b/OlpAI/Lab5/thuc_hanh_5.docx
@@ -57,12 +57,12 @@
           <wp:inline distB="0" distT="0" distL="0" distR="0">
             <wp:extent cx="5212080" cy="2978331"/>
             <wp:effectExtent b="0" l="0" r="0" t="0"/>
-            <wp:docPr id="1" name="image7.png"/>
+            <wp:docPr id="1" name="image9.png"/>
             <a:graphic>
               <a:graphicData uri="http://schemas.openxmlformats.org/drawingml/2006/picture">
                 <pic:pic>
                   <pic:nvPicPr>
-                    <pic:cNvPr id="0" name="image7.png"/>
+                    <pic:cNvPr id="0" name="image9.png"/>
                     <pic:cNvPicPr preferRelativeResize="0"/>
                   </pic:nvPicPr>
                   <pic:blipFill>
@@ -2187,12 +2187,12 @@
           <wp:inline distB="0" distT="0" distL="0" distR="0">
             <wp:extent cx="4389120" cy="621892"/>
             <wp:effectExtent b="0" l="0" r="0" t="0"/>
-            <wp:docPr id="3" name="image5.png"/>
+            <wp:docPr id="3" name="image7.png"/>
             <a:graphic>
               <a:graphicData uri="http://schemas.openxmlformats.org/drawingml/2006/picture">
                 <pic:pic>
                   <pic:nvPicPr>
-                    <pic:cNvPr id="0" name="image5.png"/>
+                    <pic:cNvPr id="0" name="image7.png"/>
                     <pic:cNvPicPr preferRelativeResize="0"/>
                   </pic:nvPicPr>
                   <pic:blipFill>
@@ -2244,12 +2244,12 @@
           <wp:inline distB="0" distT="0" distL="0" distR="0">
             <wp:extent cx="4389120" cy="621892"/>
             <wp:effectExtent b="0" l="0" r="0" t="0"/>
-            <wp:docPr id="2" name="image3.png"/>
+            <wp:docPr id="2" name="image1.png"/>
             <a:graphic>
               <a:graphicData uri="http://schemas.openxmlformats.org/drawingml/2006/picture">
                 <pic:pic>
                   <pic:nvPicPr>
-                    <pic:cNvPr id="0" name="image3.png"/>
+                    <pic:cNvPr id="0" name="image1.png"/>
                     <pic:cNvPicPr preferRelativeResize="0"/>
                   </pic:nvPicPr>
                   <pic:blipFill>
@@ -2358,12 +2358,12 @@
           <wp:inline distB="0" distT="0" distL="0" distR="0">
             <wp:extent cx="3931920" cy="557111"/>
             <wp:effectExtent b="0" l="0" r="0" t="0"/>
-            <wp:docPr id="4" name="image6.png"/>
+            <wp:docPr id="4" name="image4.png"/>
             <a:graphic>
               <a:graphicData uri="http://schemas.openxmlformats.org/drawingml/2006/picture">
                 <pic:pic>
                   <pic:nvPicPr>
-                    <pic:cNvPr id="0" name="image6.png"/>
+                    <pic:cNvPr id="0" name="image4.png"/>
                     <pic:cNvPicPr preferRelativeResize="0"/>
                   </pic:nvPicPr>
                   <pic:blipFill>
@@ -2415,12 +2415,12 @@
           <wp:inline distB="0" distT="0" distL="0" distR="0">
             <wp:extent cx="3108960" cy="440507"/>
             <wp:effectExtent b="0" l="0" r="0" t="0"/>
-            <wp:docPr id="7" name="image9.png"/>
+            <wp:docPr id="7" name="image6.png"/>
             <a:graphic>
               <a:graphicData uri="http://schemas.openxmlformats.org/drawingml/2006/picture">
                 <pic:pic>
                   <pic:nvPicPr>
-                    <pic:cNvPr id="0" name="image9.png"/>
+                    <pic:cNvPr id="0" name="image6.png"/>
                     <pic:cNvPicPr preferRelativeResize="0"/>
                   </pic:nvPicPr>
                   <pic:blipFill>
@@ -2472,12 +2472,12 @@
           <wp:inline distB="0" distT="0" distL="0" distR="0">
             <wp:extent cx="5120640" cy="725540"/>
             <wp:effectExtent b="0" l="0" r="0" t="0"/>
-            <wp:docPr id="6" name="image1.png"/>
+            <wp:docPr id="6" name="image3.png"/>
             <a:graphic>
               <a:graphicData uri="http://schemas.openxmlformats.org/drawingml/2006/picture">
                 <pic:pic>
                   <pic:nvPicPr>
-                    <pic:cNvPr id="0" name="image1.png"/>
+                    <pic:cNvPr id="0" name="image3.png"/>
                     <pic:cNvPicPr preferRelativeResize="0"/>
                   </pic:nvPicPr>
                   <pic:blipFill>
@@ -3565,12 +3565,12 @@
           <wp:inline distB="0" distT="0" distL="0" distR="0">
             <wp:extent cx="5212080" cy="2978331"/>
             <wp:effectExtent b="0" l="0" r="0" t="0"/>
-            <wp:docPr id="9" name="image7.png"/>
+            <wp:docPr id="9" name="image9.png"/>
             <a:graphic>
               <a:graphicData uri="http://schemas.openxmlformats.org/drawingml/2006/picture">
                 <pic:pic>
                   <pic:nvPicPr>
-                    <pic:cNvPr id="0" name="image7.png"/>
+                    <pic:cNvPr id="0" name="image9.png"/>
                     <pic:cNvPicPr preferRelativeResize="0"/>
                   </pic:nvPicPr>
                   <pic:blipFill>
@@ -4365,12 +4365,12 @@
           <wp:inline distB="0" distT="0" distL="0" distR="0">
             <wp:extent cx="5212080" cy="2978331"/>
             <wp:effectExtent b="0" l="0" r="0" t="0"/>
-            <wp:docPr id="8" name="image4.png"/>
+            <wp:docPr id="8" name="image5.png"/>
             <a:graphic>
               <a:graphicData uri="http://schemas.openxmlformats.org/drawingml/2006/picture">
                 <pic:pic>
                   <pic:nvPicPr>
-                    <pic:cNvPr id="0" name="image4.png"/>
+                    <pic:cNvPr id="0" name="image5.png"/>
                     <pic:cNvPicPr preferRelativeResize="0"/>
                   </pic:nvPicPr>
                   <pic:blipFill>
@@ -7338,790 +7338,6 @@
         </w:rPr>
         <w:t xml:space="preserve">Không chỉ báo cáo train loss; cần có đánh giá trên test set hoặc dữ liệu kiểm tra.</w:t>
       </w:r>
-    </w:p>
-    <w:p>
-      <w:pPr>
-        <w:pStyle w:val="Heading1"/>
-        <w:rPr/>
-      </w:pPr>
-      <w:r>
-        <w:rPr>
-          <w:rtl w:val="0"/>
-        </w:rPr>
-        <w:t xml:space="preserve">10. Hoạt động 6 - Bài tổng hợp nhiều biến: chọn đặc trưng và MLP</w:t>
-      </w:r>
-    </w:p>
-    <w:p>
-      <w:pPr>
-        <w:rPr/>
-      </w:pPr>
-      <w:r>
-        <w:rPr>
-          <w:b w:val="1"/>
-          <w:bCs w:val="1"/>
-          <w:rtl w:val="0"/>
-        </w:rPr>
-        <w:t xml:space="preserve">Dữ liệu: </w:t>
-      </w:r>
-      <w:r>
-        <w:rPr>
-          <w:rtl w:val="0"/>
-        </w:rPr>
-        <w:t xml:space="preserve">datasets/activity_06_high_dimensional_mlp.csv</w:t>
-      </w:r>
-    </w:p>
-    <w:p>
-      <w:pPr>
-        <w:rPr/>
-      </w:pPr>
-      <w:r>
-        <w:rPr>
-          <w:rtl w:val="0"/>
-        </w:rPr>
-        <w:t xml:space="preserve">Dữ liệu có 12 biến đầu vào. Chỉ một số biến thật sự ảnh hưởng đến y; một số ảnh hưởng tuyến tính, một số là phi tuyến hoặc tương tác. Đây là bài tổng hợp để sinh viên cân nhắc giữa mô hình có diễn giải tốt và mô hình linh hoạt.</w:t>
-      </w:r>
-    </w:p>
-    <w:p>
-      <w:pPr>
-        <w:pStyle w:val="Heading2"/>
-        <w:rPr/>
-      </w:pPr>
-      <w:r>
-        <w:rPr>
-          <w:rtl w:val="0"/>
-        </w:rPr>
-        <w:t xml:space="preserve">Mục tiêu học tập</w:t>
-      </w:r>
-    </w:p>
-    <w:p>
-      <w:pPr>
-        <w:keepNext w:val="0"/>
-        <w:keepLines w:val="0"/>
-        <w:pageBreakBefore w:val="0"/>
-        <w:widowControl w:val="1"/>
-        <w:numPr>
-          <w:ilvl w:val="0"/>
-          <w:numId w:val="1"/>
-        </w:numPr>
-        <w:pBdr>
-          <w:top w:space="0" w:sz="0" w:val="nil"/>
-          <w:left w:space="0" w:sz="0" w:val="nil"/>
-          <w:bottom w:space="0" w:sz="0" w:val="nil"/>
-          <w:right w:space="0" w:sz="0" w:val="nil"/>
-          <w:between w:space="0" w:sz="0" w:val="nil"/>
-        </w:pBdr>
-        <w:shd w:fill="auto" w:val="clear"/>
-        <w:spacing w:after="0" w:before="0" w:line="276" w:lineRule="auto"/>
-        <w:ind w:left="360" w:right="0" w:hanging="360"/>
-        <w:jc w:val="left"/>
-        <w:rPr/>
-      </w:pPr>
-      <w:r>
-        <w:rPr>
-          <w:rFonts w:ascii="Arial" w:cs="Arial" w:eastAsia="Arial" w:hAnsi="Arial"/>
-          <w:b w:val="0"/>
-          <w:bCs w:val="0"/>
-          <w:i w:val="0"/>
-          <w:iCs w:val="0"/>
-          <w:smallCaps w:val="0"/>
-          <w:strike w:val="0"/>
-          <w:color w:val="000000"/>
-          <w:sz w:val="21"/>
-          <w:szCs w:val="21"/>
-          <w:u w:val="none"/>
-          <w:shd w:fill="auto" w:val="clear"/>
-          <w:vertAlign w:val="baseline"/>
-          <w:rtl w:val="0"/>
-        </w:rPr>
-        <w:t xml:space="preserve">So sánh mô hình tuyến tính chính quy hóa với MLP trên dữ liệu nhiều đặc trưng.</w:t>
-      </w:r>
-    </w:p>
-    <w:p>
-      <w:pPr>
-        <w:keepNext w:val="0"/>
-        <w:keepLines w:val="0"/>
-        <w:pageBreakBefore w:val="0"/>
-        <w:widowControl w:val="1"/>
-        <w:numPr>
-          <w:ilvl w:val="0"/>
-          <w:numId w:val="1"/>
-        </w:numPr>
-        <w:pBdr>
-          <w:top w:space="0" w:sz="0" w:val="nil"/>
-          <w:left w:space="0" w:sz="0" w:val="nil"/>
-          <w:bottom w:space="0" w:sz="0" w:val="nil"/>
-          <w:right w:space="0" w:sz="0" w:val="nil"/>
-          <w:between w:space="0" w:sz="0" w:val="nil"/>
-        </w:pBdr>
-        <w:shd w:fill="auto" w:val="clear"/>
-        <w:spacing w:after="0" w:before="0" w:line="276" w:lineRule="auto"/>
-        <w:ind w:left="360" w:right="0" w:hanging="360"/>
-        <w:jc w:val="left"/>
-        <w:rPr/>
-      </w:pPr>
-      <w:r>
-        <w:rPr>
-          <w:rFonts w:ascii="Arial" w:cs="Arial" w:eastAsia="Arial" w:hAnsi="Arial"/>
-          <w:b w:val="0"/>
-          <w:bCs w:val="0"/>
-          <w:i w:val="0"/>
-          <w:iCs w:val="0"/>
-          <w:smallCaps w:val="0"/>
-          <w:strike w:val="0"/>
-          <w:color w:val="000000"/>
-          <w:sz w:val="21"/>
-          <w:szCs w:val="21"/>
-          <w:u w:val="none"/>
-          <w:shd w:fill="auto" w:val="clear"/>
-          <w:vertAlign w:val="baseline"/>
-          <w:rtl w:val="0"/>
-        </w:rPr>
-        <w:t xml:space="preserve">Quan sát Lasso có thể đưa một số hệ số về gần 0.</w:t>
-      </w:r>
-    </w:p>
-    <w:p>
-      <w:pPr>
-        <w:keepNext w:val="0"/>
-        <w:keepLines w:val="0"/>
-        <w:pageBreakBefore w:val="0"/>
-        <w:widowControl w:val="1"/>
-        <w:numPr>
-          <w:ilvl w:val="0"/>
-          <w:numId w:val="1"/>
-        </w:numPr>
-        <w:pBdr>
-          <w:top w:space="0" w:sz="0" w:val="nil"/>
-          <w:left w:space="0" w:sz="0" w:val="nil"/>
-          <w:bottom w:space="0" w:sz="0" w:val="nil"/>
-          <w:right w:space="0" w:sz="0" w:val="nil"/>
-          <w:between w:space="0" w:sz="0" w:val="nil"/>
-        </w:pBdr>
-        <w:shd w:fill="auto" w:val="clear"/>
-        <w:spacing w:after="0" w:before="0" w:line="276" w:lineRule="auto"/>
-        <w:ind w:left="360" w:right="0" w:hanging="360"/>
-        <w:jc w:val="left"/>
-        <w:rPr/>
-      </w:pPr>
-      <w:r>
-        <w:rPr>
-          <w:rFonts w:ascii="Arial" w:cs="Arial" w:eastAsia="Arial" w:hAnsi="Arial"/>
-          <w:b w:val="0"/>
-          <w:bCs w:val="0"/>
-          <w:i w:val="0"/>
-          <w:iCs w:val="0"/>
-          <w:smallCaps w:val="0"/>
-          <w:strike w:val="0"/>
-          <w:color w:val="000000"/>
-          <w:sz w:val="21"/>
-          <w:szCs w:val="21"/>
-          <w:u w:val="none"/>
-          <w:shd w:fill="auto" w:val="clear"/>
-          <w:vertAlign w:val="baseline"/>
-          <w:rtl w:val="0"/>
-        </w:rPr>
-        <w:t xml:space="preserve">Dùng permutation importance để phân tích tầm quan trọng đặc trưng trong MLP.</w:t>
-      </w:r>
-    </w:p>
-    <w:p>
-      <w:pPr>
-        <w:keepNext w:val="0"/>
-        <w:keepLines w:val="0"/>
-        <w:pageBreakBefore w:val="0"/>
-        <w:widowControl w:val="1"/>
-        <w:numPr>
-          <w:ilvl w:val="0"/>
-          <w:numId w:val="1"/>
-        </w:numPr>
-        <w:pBdr>
-          <w:top w:space="0" w:sz="0" w:val="nil"/>
-          <w:left w:space="0" w:sz="0" w:val="nil"/>
-          <w:bottom w:space="0" w:sz="0" w:val="nil"/>
-          <w:right w:space="0" w:sz="0" w:val="nil"/>
-          <w:between w:space="0" w:sz="0" w:val="nil"/>
-        </w:pBdr>
-        <w:shd w:fill="auto" w:val="clear"/>
-        <w:spacing w:after="200" w:before="0" w:line="276" w:lineRule="auto"/>
-        <w:ind w:left="360" w:right="0" w:hanging="360"/>
-        <w:jc w:val="left"/>
-        <w:rPr/>
-      </w:pPr>
-      <w:r>
-        <w:rPr>
-          <w:rFonts w:ascii="Arial" w:cs="Arial" w:eastAsia="Arial" w:hAnsi="Arial"/>
-          <w:b w:val="0"/>
-          <w:bCs w:val="0"/>
-          <w:i w:val="0"/>
-          <w:iCs w:val="0"/>
-          <w:smallCaps w:val="0"/>
-          <w:strike w:val="0"/>
-          <w:color w:val="000000"/>
-          <w:sz w:val="21"/>
-          <w:szCs w:val="21"/>
-          <w:u w:val="none"/>
-          <w:shd w:fill="auto" w:val="clear"/>
-          <w:vertAlign w:val="baseline"/>
-          <w:rtl w:val="0"/>
-        </w:rPr>
-        <w:t xml:space="preserve">Viết báo cáo ngắn về trade-off giữa khả năng dự báo và khả năng diễn giải.</w:t>
-      </w:r>
-    </w:p>
-    <w:p>
-      <w:pPr>
-        <w:pStyle w:val="Heading2"/>
-        <w:rPr/>
-      </w:pPr>
-      <w:r>
-        <w:rPr>
-          <w:rtl w:val="0"/>
-        </w:rPr>
-        <w:t xml:space="preserve">Nhiệm vụ thực hành</w:t>
-      </w:r>
-    </w:p>
-    <w:p>
-      <w:pPr>
-        <w:keepNext w:val="0"/>
-        <w:keepLines w:val="0"/>
-        <w:pageBreakBefore w:val="0"/>
-        <w:widowControl w:val="1"/>
-        <w:numPr>
-          <w:ilvl w:val="0"/>
-          <w:numId w:val="2"/>
-        </w:numPr>
-        <w:pBdr>
-          <w:top w:space="0" w:sz="0" w:val="nil"/>
-          <w:left w:space="0" w:sz="0" w:val="nil"/>
-          <w:bottom w:space="0" w:sz="0" w:val="nil"/>
-          <w:right w:space="0" w:sz="0" w:val="nil"/>
-          <w:between w:space="0" w:sz="0" w:val="nil"/>
-        </w:pBdr>
-        <w:shd w:fill="auto" w:val="clear"/>
-        <w:spacing w:after="0" w:before="0" w:line="276" w:lineRule="auto"/>
-        <w:ind w:left="360" w:right="0" w:hanging="360"/>
-        <w:jc w:val="left"/>
-        <w:rPr/>
-      </w:pPr>
-      <w:r>
-        <w:rPr>
-          <w:rFonts w:ascii="Arial" w:cs="Arial" w:eastAsia="Arial" w:hAnsi="Arial"/>
-          <w:b w:val="0"/>
-          <w:bCs w:val="0"/>
-          <w:i w:val="0"/>
-          <w:iCs w:val="0"/>
-          <w:smallCaps w:val="0"/>
-          <w:strike w:val="0"/>
-          <w:color w:val="000000"/>
-          <w:sz w:val="21"/>
-          <w:szCs w:val="21"/>
-          <w:u w:val="none"/>
-          <w:shd w:fill="auto" w:val="clear"/>
-          <w:vertAlign w:val="baseline"/>
-          <w:rtl w:val="0"/>
-        </w:rPr>
-        <w:t xml:space="preserve">Chuẩn hóa dữ liệu bằng StandardScaler.</w:t>
-      </w:r>
-    </w:p>
-    <w:p>
-      <w:pPr>
-        <w:keepNext w:val="0"/>
-        <w:keepLines w:val="0"/>
-        <w:pageBreakBefore w:val="0"/>
-        <w:widowControl w:val="1"/>
-        <w:numPr>
-          <w:ilvl w:val="0"/>
-          <w:numId w:val="2"/>
-        </w:numPr>
-        <w:pBdr>
-          <w:top w:space="0" w:sz="0" w:val="nil"/>
-          <w:left w:space="0" w:sz="0" w:val="nil"/>
-          <w:bottom w:space="0" w:sz="0" w:val="nil"/>
-          <w:right w:space="0" w:sz="0" w:val="nil"/>
-          <w:between w:space="0" w:sz="0" w:val="nil"/>
-        </w:pBdr>
-        <w:shd w:fill="auto" w:val="clear"/>
-        <w:spacing w:after="0" w:before="0" w:line="276" w:lineRule="auto"/>
-        <w:ind w:left="360" w:right="0" w:hanging="360"/>
-        <w:jc w:val="left"/>
-        <w:rPr/>
-      </w:pPr>
-      <w:r>
-        <w:rPr>
-          <w:rFonts w:ascii="Arial" w:cs="Arial" w:eastAsia="Arial" w:hAnsi="Arial"/>
-          <w:b w:val="0"/>
-          <w:bCs w:val="0"/>
-          <w:i w:val="0"/>
-          <w:iCs w:val="0"/>
-          <w:smallCaps w:val="0"/>
-          <w:strike w:val="0"/>
-          <w:color w:val="000000"/>
-          <w:sz w:val="21"/>
-          <w:szCs w:val="21"/>
-          <w:u w:val="none"/>
-          <w:shd w:fill="auto" w:val="clear"/>
-          <w:vertAlign w:val="baseline"/>
-          <w:rtl w:val="0"/>
-        </w:rPr>
-        <w:t xml:space="preserve">Huấn luyện Linear Regression, Ridge, Lasso, Elastic Net và MLP.</w:t>
-      </w:r>
-    </w:p>
-    <w:p>
-      <w:pPr>
-        <w:keepNext w:val="0"/>
-        <w:keepLines w:val="0"/>
-        <w:pageBreakBefore w:val="0"/>
-        <w:widowControl w:val="1"/>
-        <w:numPr>
-          <w:ilvl w:val="0"/>
-          <w:numId w:val="2"/>
-        </w:numPr>
-        <w:pBdr>
-          <w:top w:space="0" w:sz="0" w:val="nil"/>
-          <w:left w:space="0" w:sz="0" w:val="nil"/>
-          <w:bottom w:space="0" w:sz="0" w:val="nil"/>
-          <w:right w:space="0" w:sz="0" w:val="nil"/>
-          <w:between w:space="0" w:sz="0" w:val="nil"/>
-        </w:pBdr>
-        <w:shd w:fill="auto" w:val="clear"/>
-        <w:spacing w:after="0" w:before="0" w:line="276" w:lineRule="auto"/>
-        <w:ind w:left="360" w:right="0" w:hanging="360"/>
-        <w:jc w:val="left"/>
-        <w:rPr/>
-      </w:pPr>
-      <w:r>
-        <w:rPr>
-          <w:rFonts w:ascii="Arial" w:cs="Arial" w:eastAsia="Arial" w:hAnsi="Arial"/>
-          <w:b w:val="0"/>
-          <w:bCs w:val="0"/>
-          <w:i w:val="0"/>
-          <w:iCs w:val="0"/>
-          <w:smallCaps w:val="0"/>
-          <w:strike w:val="0"/>
-          <w:color w:val="000000"/>
-          <w:sz w:val="21"/>
-          <w:szCs w:val="21"/>
-          <w:u w:val="none"/>
-          <w:shd w:fill="auto" w:val="clear"/>
-          <w:vertAlign w:val="baseline"/>
-          <w:rtl w:val="0"/>
-        </w:rPr>
-        <w:t xml:space="preserve">So sánh train/test RMSE và MAE.</w:t>
-      </w:r>
-    </w:p>
-    <w:p>
-      <w:pPr>
-        <w:keepNext w:val="0"/>
-        <w:keepLines w:val="0"/>
-        <w:pageBreakBefore w:val="0"/>
-        <w:widowControl w:val="1"/>
-        <w:numPr>
-          <w:ilvl w:val="0"/>
-          <w:numId w:val="2"/>
-        </w:numPr>
-        <w:pBdr>
-          <w:top w:space="0" w:sz="0" w:val="nil"/>
-          <w:left w:space="0" w:sz="0" w:val="nil"/>
-          <w:bottom w:space="0" w:sz="0" w:val="nil"/>
-          <w:right w:space="0" w:sz="0" w:val="nil"/>
-          <w:between w:space="0" w:sz="0" w:val="nil"/>
-        </w:pBdr>
-        <w:shd w:fill="auto" w:val="clear"/>
-        <w:spacing w:after="0" w:before="0" w:line="276" w:lineRule="auto"/>
-        <w:ind w:left="360" w:right="0" w:hanging="360"/>
-        <w:jc w:val="left"/>
-        <w:rPr/>
-      </w:pPr>
-      <w:r>
-        <w:rPr>
-          <w:rFonts w:ascii="Arial" w:cs="Arial" w:eastAsia="Arial" w:hAnsi="Arial"/>
-          <w:b w:val="0"/>
-          <w:bCs w:val="0"/>
-          <w:i w:val="0"/>
-          <w:iCs w:val="0"/>
-          <w:smallCaps w:val="0"/>
-          <w:strike w:val="0"/>
-          <w:color w:val="000000"/>
-          <w:sz w:val="21"/>
-          <w:szCs w:val="21"/>
-          <w:u w:val="none"/>
-          <w:shd w:fill="auto" w:val="clear"/>
-          <w:vertAlign w:val="baseline"/>
-          <w:rtl w:val="0"/>
-        </w:rPr>
-        <w:t xml:space="preserve">Kiểm tra hệ số của Lasso.</w:t>
-      </w:r>
-    </w:p>
-    <w:p>
-      <w:pPr>
-        <w:keepNext w:val="0"/>
-        <w:keepLines w:val="0"/>
-        <w:pageBreakBefore w:val="0"/>
-        <w:widowControl w:val="1"/>
-        <w:numPr>
-          <w:ilvl w:val="0"/>
-          <w:numId w:val="2"/>
-        </w:numPr>
-        <w:pBdr>
-          <w:top w:space="0" w:sz="0" w:val="nil"/>
-          <w:left w:space="0" w:sz="0" w:val="nil"/>
-          <w:bottom w:space="0" w:sz="0" w:val="nil"/>
-          <w:right w:space="0" w:sz="0" w:val="nil"/>
-          <w:between w:space="0" w:sz="0" w:val="nil"/>
-        </w:pBdr>
-        <w:shd w:fill="auto" w:val="clear"/>
-        <w:spacing w:after="0" w:before="0" w:line="276" w:lineRule="auto"/>
-        <w:ind w:left="360" w:right="0" w:hanging="360"/>
-        <w:jc w:val="left"/>
-        <w:rPr/>
-      </w:pPr>
-      <w:r>
-        <w:rPr>
-          <w:rFonts w:ascii="Arial" w:cs="Arial" w:eastAsia="Arial" w:hAnsi="Arial"/>
-          <w:b w:val="0"/>
-          <w:bCs w:val="0"/>
-          <w:i w:val="0"/>
-          <w:iCs w:val="0"/>
-          <w:smallCaps w:val="0"/>
-          <w:strike w:val="0"/>
-          <w:color w:val="000000"/>
-          <w:sz w:val="21"/>
-          <w:szCs w:val="21"/>
-          <w:u w:val="none"/>
-          <w:shd w:fill="auto" w:val="clear"/>
-          <w:vertAlign w:val="baseline"/>
-          <w:rtl w:val="0"/>
-        </w:rPr>
-        <w:t xml:space="preserve">Tính permutation importance cho MLP.</w:t>
-      </w:r>
-    </w:p>
-    <w:p>
-      <w:pPr>
-        <w:keepNext w:val="0"/>
-        <w:keepLines w:val="0"/>
-        <w:pageBreakBefore w:val="0"/>
-        <w:widowControl w:val="1"/>
-        <w:numPr>
-          <w:ilvl w:val="0"/>
-          <w:numId w:val="2"/>
-        </w:numPr>
-        <w:pBdr>
-          <w:top w:space="0" w:sz="0" w:val="nil"/>
-          <w:left w:space="0" w:sz="0" w:val="nil"/>
-          <w:bottom w:space="0" w:sz="0" w:val="nil"/>
-          <w:right w:space="0" w:sz="0" w:val="nil"/>
-          <w:between w:space="0" w:sz="0" w:val="nil"/>
-        </w:pBdr>
-        <w:shd w:fill="auto" w:val="clear"/>
-        <w:spacing w:after="200" w:before="0" w:line="276" w:lineRule="auto"/>
-        <w:ind w:left="360" w:right="0" w:hanging="360"/>
-        <w:jc w:val="left"/>
-        <w:rPr/>
-      </w:pPr>
-      <w:r>
-        <w:rPr>
-          <w:rFonts w:ascii="Arial" w:cs="Arial" w:eastAsia="Arial" w:hAnsi="Arial"/>
-          <w:b w:val="0"/>
-          <w:bCs w:val="0"/>
-          <w:i w:val="0"/>
-          <w:iCs w:val="0"/>
-          <w:smallCaps w:val="0"/>
-          <w:strike w:val="0"/>
-          <w:color w:val="000000"/>
-          <w:sz w:val="21"/>
-          <w:szCs w:val="21"/>
-          <w:u w:val="none"/>
-          <w:shd w:fill="auto" w:val="clear"/>
-          <w:vertAlign w:val="baseline"/>
-          <w:rtl w:val="0"/>
-        </w:rPr>
-        <w:t xml:space="preserve">Viết báo cáo 1-2 trang về kết quả và khuyến nghị mô hình.</w:t>
-      </w:r>
-    </w:p>
-    <w:p>
-      <w:pPr>
-        <w:pStyle w:val="Heading2"/>
-        <w:rPr/>
-      </w:pPr>
-      <w:r>
-        <w:rPr>
-          <w:rtl w:val="0"/>
-        </w:rPr>
-        <w:t xml:space="preserve">Câu hỏi thảo luận</w:t>
-      </w:r>
-    </w:p>
-    <w:p>
-      <w:pPr>
-        <w:keepNext w:val="0"/>
-        <w:keepLines w:val="0"/>
-        <w:pageBreakBefore w:val="0"/>
-        <w:widowControl w:val="1"/>
-        <w:numPr>
-          <w:ilvl w:val="0"/>
-          <w:numId w:val="1"/>
-        </w:numPr>
-        <w:pBdr>
-          <w:top w:space="0" w:sz="0" w:val="nil"/>
-          <w:left w:space="0" w:sz="0" w:val="nil"/>
-          <w:bottom w:space="0" w:sz="0" w:val="nil"/>
-          <w:right w:space="0" w:sz="0" w:val="nil"/>
-          <w:between w:space="0" w:sz="0" w:val="nil"/>
-        </w:pBdr>
-        <w:shd w:fill="auto" w:val="clear"/>
-        <w:spacing w:after="0" w:before="0" w:line="276" w:lineRule="auto"/>
-        <w:ind w:left="360" w:right="0" w:hanging="360"/>
-        <w:jc w:val="left"/>
-        <w:rPr/>
-      </w:pPr>
-      <w:r>
-        <w:rPr>
-          <w:rFonts w:ascii="Arial" w:cs="Arial" w:eastAsia="Arial" w:hAnsi="Arial"/>
-          <w:b w:val="0"/>
-          <w:bCs w:val="0"/>
-          <w:i w:val="0"/>
-          <w:iCs w:val="0"/>
-          <w:smallCaps w:val="0"/>
-          <w:strike w:val="0"/>
-          <w:color w:val="000000"/>
-          <w:sz w:val="21"/>
-          <w:szCs w:val="21"/>
-          <w:u w:val="none"/>
-          <w:shd w:fill="auto" w:val="clear"/>
-          <w:vertAlign w:val="baseline"/>
-          <w:rtl w:val="0"/>
-        </w:rPr>
-        <w:t xml:space="preserve">Lasso có phát hiện được biến nhiễu không?</w:t>
-      </w:r>
-    </w:p>
-    <w:p>
-      <w:pPr>
-        <w:keepNext w:val="0"/>
-        <w:keepLines w:val="0"/>
-        <w:pageBreakBefore w:val="0"/>
-        <w:widowControl w:val="1"/>
-        <w:numPr>
-          <w:ilvl w:val="0"/>
-          <w:numId w:val="1"/>
-        </w:numPr>
-        <w:pBdr>
-          <w:top w:space="0" w:sz="0" w:val="nil"/>
-          <w:left w:space="0" w:sz="0" w:val="nil"/>
-          <w:bottom w:space="0" w:sz="0" w:val="nil"/>
-          <w:right w:space="0" w:sz="0" w:val="nil"/>
-          <w:between w:space="0" w:sz="0" w:val="nil"/>
-        </w:pBdr>
-        <w:shd w:fill="auto" w:val="clear"/>
-        <w:spacing w:after="0" w:before="0" w:line="276" w:lineRule="auto"/>
-        <w:ind w:left="360" w:right="0" w:hanging="360"/>
-        <w:jc w:val="left"/>
-        <w:rPr/>
-      </w:pPr>
-      <w:r>
-        <w:rPr>
-          <w:rFonts w:ascii="Arial" w:cs="Arial" w:eastAsia="Arial" w:hAnsi="Arial"/>
-          <w:b w:val="0"/>
-          <w:bCs w:val="0"/>
-          <w:i w:val="0"/>
-          <w:iCs w:val="0"/>
-          <w:smallCaps w:val="0"/>
-          <w:strike w:val="0"/>
-          <w:color w:val="000000"/>
-          <w:sz w:val="21"/>
-          <w:szCs w:val="21"/>
-          <w:u w:val="none"/>
-          <w:shd w:fill="auto" w:val="clear"/>
-          <w:vertAlign w:val="baseline"/>
-          <w:rtl w:val="0"/>
-        </w:rPr>
-        <w:t xml:space="preserve">Vì sao Lasso khó phát hiện quan hệ phi tuyến nếu không có feature engineering?</w:t>
-      </w:r>
-    </w:p>
-    <w:p>
-      <w:pPr>
-        <w:keepNext w:val="0"/>
-        <w:keepLines w:val="0"/>
-        <w:pageBreakBefore w:val="0"/>
-        <w:widowControl w:val="1"/>
-        <w:numPr>
-          <w:ilvl w:val="0"/>
-          <w:numId w:val="1"/>
-        </w:numPr>
-        <w:pBdr>
-          <w:top w:space="0" w:sz="0" w:val="nil"/>
-          <w:left w:space="0" w:sz="0" w:val="nil"/>
-          <w:bottom w:space="0" w:sz="0" w:val="nil"/>
-          <w:right w:space="0" w:sz="0" w:val="nil"/>
-          <w:between w:space="0" w:sz="0" w:val="nil"/>
-        </w:pBdr>
-        <w:shd w:fill="auto" w:val="clear"/>
-        <w:spacing w:after="200" w:before="0" w:line="276" w:lineRule="auto"/>
-        <w:ind w:left="360" w:right="0" w:hanging="360"/>
-        <w:jc w:val="left"/>
-        <w:rPr/>
-      </w:pPr>
-      <w:r>
-        <w:rPr>
-          <w:rFonts w:ascii="Arial" w:cs="Arial" w:eastAsia="Arial" w:hAnsi="Arial"/>
-          <w:b w:val="0"/>
-          <w:bCs w:val="0"/>
-          <w:i w:val="0"/>
-          <w:iCs w:val="0"/>
-          <w:smallCaps w:val="0"/>
-          <w:strike w:val="0"/>
-          <w:color w:val="000000"/>
-          <w:sz w:val="21"/>
-          <w:szCs w:val="21"/>
-          <w:u w:val="none"/>
-          <w:shd w:fill="auto" w:val="clear"/>
-          <w:vertAlign w:val="baseline"/>
-          <w:rtl w:val="0"/>
-        </w:rPr>
-        <w:t xml:space="preserve">MLP linh hoạt hơn nhưng khó diễn giải hơn ở điểm nào?</w:t>
-      </w:r>
-    </w:p>
-    <w:p>
-      <w:pPr>
-        <w:pStyle w:val="Heading2"/>
-        <w:rPr/>
-      </w:pPr>
-      <w:r>
-        <w:rPr>
-          <w:rtl w:val="0"/>
-        </w:rPr>
-        <w:t xml:space="preserve">Sản phẩm cần nộp</w:t>
-      </w:r>
-    </w:p>
-    <w:p>
-      <w:pPr>
-        <w:keepNext w:val="0"/>
-        <w:keepLines w:val="0"/>
-        <w:pageBreakBefore w:val="0"/>
-        <w:widowControl w:val="1"/>
-        <w:numPr>
-          <w:ilvl w:val="0"/>
-          <w:numId w:val="1"/>
-        </w:numPr>
-        <w:pBdr>
-          <w:top w:space="0" w:sz="0" w:val="nil"/>
-          <w:left w:space="0" w:sz="0" w:val="nil"/>
-          <w:bottom w:space="0" w:sz="0" w:val="nil"/>
-          <w:right w:space="0" w:sz="0" w:val="nil"/>
-          <w:between w:space="0" w:sz="0" w:val="nil"/>
-        </w:pBdr>
-        <w:shd w:fill="auto" w:val="clear"/>
-        <w:spacing w:after="0" w:before="0" w:line="276" w:lineRule="auto"/>
-        <w:ind w:left="360" w:right="0" w:hanging="360"/>
-        <w:jc w:val="left"/>
-        <w:rPr/>
-      </w:pPr>
-      <w:r>
-        <w:rPr>
-          <w:rFonts w:ascii="Arial" w:cs="Arial" w:eastAsia="Arial" w:hAnsi="Arial"/>
-          <w:b w:val="0"/>
-          <w:bCs w:val="0"/>
-          <w:i w:val="0"/>
-          <w:iCs w:val="0"/>
-          <w:smallCaps w:val="0"/>
-          <w:strike w:val="0"/>
-          <w:color w:val="000000"/>
-          <w:sz w:val="21"/>
-          <w:szCs w:val="21"/>
-          <w:u w:val="none"/>
-          <w:shd w:fill="auto" w:val="clear"/>
-          <w:vertAlign w:val="baseline"/>
-          <w:rtl w:val="0"/>
-        </w:rPr>
-        <w:t xml:space="preserve">Notebook đã chạy đầy đủ, có biểu đồ và bảng kết quả.</w:t>
-      </w:r>
-    </w:p>
-    <w:p>
-      <w:pPr>
-        <w:keepNext w:val="0"/>
-        <w:keepLines w:val="0"/>
-        <w:pageBreakBefore w:val="0"/>
-        <w:widowControl w:val="1"/>
-        <w:numPr>
-          <w:ilvl w:val="0"/>
-          <w:numId w:val="1"/>
-        </w:numPr>
-        <w:pBdr>
-          <w:top w:space="0" w:sz="0" w:val="nil"/>
-          <w:left w:space="0" w:sz="0" w:val="nil"/>
-          <w:bottom w:space="0" w:sz="0" w:val="nil"/>
-          <w:right w:space="0" w:sz="0" w:val="nil"/>
-          <w:between w:space="0" w:sz="0" w:val="nil"/>
-        </w:pBdr>
-        <w:shd w:fill="auto" w:val="clear"/>
-        <w:spacing w:after="0" w:before="0" w:line="276" w:lineRule="auto"/>
-        <w:ind w:left="360" w:right="0" w:hanging="360"/>
-        <w:jc w:val="left"/>
-        <w:rPr/>
-      </w:pPr>
-      <w:r>
-        <w:rPr>
-          <w:rFonts w:ascii="Arial" w:cs="Arial" w:eastAsia="Arial" w:hAnsi="Arial"/>
-          <w:b w:val="0"/>
-          <w:bCs w:val="0"/>
-          <w:i w:val="0"/>
-          <w:iCs w:val="0"/>
-          <w:smallCaps w:val="0"/>
-          <w:strike w:val="0"/>
-          <w:color w:val="000000"/>
-          <w:sz w:val="21"/>
-          <w:szCs w:val="21"/>
-          <w:u w:val="none"/>
-          <w:shd w:fill="auto" w:val="clear"/>
-          <w:vertAlign w:val="baseline"/>
-          <w:rtl w:val="0"/>
-        </w:rPr>
-        <w:t xml:space="preserve">Nhận xét ngắn bằng tiếng Việt, giải thích mô hình nào phù hợp và vì sao.</w:t>
-      </w:r>
-    </w:p>
-    <w:p>
-      <w:pPr>
-        <w:keepNext w:val="0"/>
-        <w:keepLines w:val="0"/>
-        <w:pageBreakBefore w:val="0"/>
-        <w:widowControl w:val="1"/>
-        <w:numPr>
-          <w:ilvl w:val="0"/>
-          <w:numId w:val="1"/>
-        </w:numPr>
-        <w:pBdr>
-          <w:top w:space="0" w:sz="0" w:val="nil"/>
-          <w:left w:space="0" w:sz="0" w:val="nil"/>
-          <w:bottom w:space="0" w:sz="0" w:val="nil"/>
-          <w:right w:space="0" w:sz="0" w:val="nil"/>
-          <w:between w:space="0" w:sz="0" w:val="nil"/>
-        </w:pBdr>
-        <w:shd w:fill="auto" w:val="clear"/>
-        <w:spacing w:after="200" w:before="0" w:line="276" w:lineRule="auto"/>
-        <w:ind w:left="360" w:right="0" w:hanging="360"/>
-        <w:jc w:val="left"/>
-        <w:rPr/>
-      </w:pPr>
-      <w:r>
-        <w:rPr>
-          <w:rFonts w:ascii="Arial" w:cs="Arial" w:eastAsia="Arial" w:hAnsi="Arial"/>
-          <w:b w:val="0"/>
-          <w:bCs w:val="0"/>
-          <w:i w:val="0"/>
-          <w:iCs w:val="0"/>
-          <w:smallCaps w:val="0"/>
-          <w:strike w:val="0"/>
-          <w:color w:val="000000"/>
-          <w:sz w:val="21"/>
-          <w:szCs w:val="21"/>
-          <w:u w:val="none"/>
-          <w:shd w:fill="auto" w:val="clear"/>
-          <w:vertAlign w:val="baseline"/>
-          <w:rtl w:val="0"/>
-        </w:rPr>
-        <w:t xml:space="preserve">Không chỉ báo cáo train loss; cần có đánh giá trên test set hoặc dữ liệu kiểm tra.</w:t>
-      </w:r>
-    </w:p>
-    <w:p>
-      <w:pPr>
-        <w:pStyle w:val="Heading2"/>
-        <w:rPr/>
-      </w:pPr>
       <w:r>
         <w:rPr>
           <w:rtl w:val="0"/>

</xml_diff>